<commit_message>
Rapikan Bab 3 Pendanaan, Tambah Wireframe
</commit_message>
<xml_diff>
--- a/Dokumen/Done/Muhammad Kholis - Surat Permintaan Data.docx
+++ b/Dokumen/Done/Muhammad Kholis - Surat Permintaan Data.docx
@@ -66,7 +66,7 @@
           <w:sz w:val="24"/>
           <w:szCs w:val="24"/>
         </w:rPr>
-        <w:t>3</w:t>
+        <w:t>10</w:t>
       </w:r>
       <w:r>
         <w:rPr>
@@ -164,6 +164,7 @@
     <w:p>
       <w:pPr>
         <w:rPr>
+          <w:rFonts w:cs="Times New Roman"/>
           <w:b/>
           <w:sz w:val="24"/>
           <w:szCs w:val="24"/>
@@ -171,11 +172,12 @@
       </w:pPr>
       <w:r>
         <w:rPr>
+          <w:rFonts w:cs="Times New Roman"/>
           <w:b/>
           <w:sz w:val="24"/>
           <w:szCs w:val="24"/>
         </w:rPr>
-        <w:t>Bapak Kepala Dinas Pertanian dan Tanaman Pangan</w:t>
+        <w:t>Keluarga Mahasiswa Teknik Elektro dan Informatika</w:t>
       </w:r>
     </w:p>
     <w:p>
@@ -188,11 +190,12 @@
       </w:pPr>
       <w:r>
         <w:rPr>
+          <w:rFonts w:cs="Times New Roman"/>
           <w:b/>
           <w:sz w:val="24"/>
           <w:szCs w:val="24"/>
         </w:rPr>
-        <w:t>Kabupaten Aceh Utara</w:t>
+        <w:t>Sekolah Vokasi Universitas Gadjah Mada</w:t>
       </w:r>
     </w:p>
     <w:p>
@@ -2098,13 +2101,14 @@
       </w:r>
       <w:r>
         <w:rPr>
+          <w:rFonts w:cs="Times New Roman"/>
           <w:b/>
           <w:bCs/>
           <w:spacing w:val="2"/>
           <w:sz w:val="24"/>
           <w:szCs w:val="24"/>
         </w:rPr>
-        <w:t>DINAS PERTANIAN</w:t>
+        <w:t>KELUARGA MAHASISWA TEKNIK ELEKTRO</w:t>
       </w:r>
       <w:r>
         <w:rPr>
@@ -2114,17 +2118,18 @@
           <w:sz w:val="24"/>
           <w:szCs w:val="24"/>
         </w:rPr>
-        <w:t xml:space="preserve"> DAN TANAMAN PANGAN</w:t>
-      </w:r>
-      <w:r>
-        <w:rPr>
+        <w:t xml:space="preserve"> DAN </w:t>
+      </w:r>
+      <w:r>
+        <w:rPr>
+          <w:rFonts w:cs="Times New Roman"/>
           <w:b/>
           <w:bCs/>
           <w:spacing w:val="2"/>
           <w:sz w:val="24"/>
           <w:szCs w:val="24"/>
         </w:rPr>
-        <w:t xml:space="preserve"> </w:t>
+        <w:t>INFORMATIKA SEKOLAH VOKASI UNIVERSITAS GADJAH MAD</w:t>
       </w:r>
       <w:r>
         <w:rPr>
@@ -2134,17 +2139,7 @@
           <w:sz w:val="24"/>
           <w:szCs w:val="24"/>
         </w:rPr>
-        <w:t xml:space="preserve">KABUPATEN </w:t>
-      </w:r>
-      <w:r>
-        <w:rPr>
-          <w:b/>
-          <w:bCs/>
-          <w:spacing w:val="2"/>
-          <w:sz w:val="24"/>
-          <w:szCs w:val="24"/>
-        </w:rPr>
-        <w:t>ACEH UTARA</w:t>
+        <w:t>A</w:t>
       </w:r>
       <w:r>
         <w:rPr>
@@ -2868,6 +2863,13 @@
               </w:rPr>
               <w:t>Transaksi Penjualan</w:t>
             </w:r>
+            <w:r>
+              <w:rPr>
+                <w:sz w:val="24"/>
+                <w:szCs w:val="24"/>
+              </w:rPr>
+              <w:t xml:space="preserve"> Website Eat’s TEDI</w:t>
+            </w:r>
           </w:p>
         </w:tc>
       </w:tr>
@@ -3512,7 +3514,12 @@
     </w:p>
     <w:p/>
     <w:sectPr>
-      <w:headerReference w:type="default" r:id="rId7"/>
+      <w:headerReference w:type="even" r:id="rId7"/>
+      <w:headerReference w:type="default" r:id="rId8"/>
+      <w:footerReference w:type="even" r:id="rId9"/>
+      <w:footerReference w:type="default" r:id="rId10"/>
+      <w:headerReference w:type="first" r:id="rId11"/>
+      <w:footerReference w:type="first" r:id="rId12"/>
       <w:pgSz w:w="12242" w:h="20163" w:code="5"/>
       <w:pgMar w:top="1440" w:right="1440" w:bottom="1440" w:left="1440" w:header="720" w:footer="720" w:gutter="0"/>
       <w:cols w:space="720"/>
@@ -3541,6 +3548,36 @@
 </w:endnotes>
 </file>
 
+<file path=word/footer1.xml><?xml version="1.0" encoding="utf-8"?>
+<w:ftr xmlns:wpc="http://schemas.microsoft.com/office/word/2010/wordprocessingCanvas" xmlns:cx="http://schemas.microsoft.com/office/drawing/2014/chartex" xmlns:cx1="http://schemas.microsoft.com/office/drawing/2015/9/8/chartex" xmlns:cx2="http://schemas.microsoft.com/office/drawing/2015/10/21/chartex" xmlns:cx3="http://schemas.microsoft.com/office/drawing/2016/5/9/chartex" xmlns:cx4="http://schemas.microsoft.com/office/drawing/2016/5/10/chartex" xmlns:cx5="http://schemas.microsoft.com/office/drawing/2016/5/11/chartex" xmlns:cx6="http://schemas.microsoft.com/office/drawing/2016/5/12/chartex" xmlns:cx7="http://schemas.microsoft.com/office/drawing/2016/5/13/chartex" xmlns:cx8="http://schemas.microsoft.com/office/drawing/2016/5/14/chartex" xmlns:mc="http://schemas.openxmlformats.org/markup-compatibility/2006" xmlns:aink="http://schemas.microsoft.com/office/drawing/2016/ink" xmlns:am3d="http://schemas.microsoft.com/office/drawing/2017/model3d" xmlns:o="urn:schemas-microsoft-com:office:office" xmlns:oel="http://schemas.microsoft.com/office/2019/extlst" xmlns:r="http://schemas.openxmlformats.org/officeDocument/2006/relationships" xmlns:m="http://schemas.openxmlformats.org/officeDocument/2006/math" xmlns:v="urn:schemas-microsoft-com:vml" xmlns:wp14="http://schemas.microsoft.com/office/word/2010/wordprocessingDrawing" xmlns:wp="http://schemas.openxmlformats.org/drawingml/2006/wordprocessingDrawing" xmlns:w10="urn:schemas-microsoft-com:office:word" xmlns:w="http://schemas.openxmlformats.org/wordprocessingml/2006/main" xmlns:w14="http://schemas.microsoft.com/office/word/2010/wordml" xmlns:w15="http://schemas.microsoft.com/office/word/2012/wordml" xmlns:w16cex="http://schemas.microsoft.com/office/word/2018/wordml/cex" xmlns:w16cid="http://schemas.microsoft.com/office/word/2016/wordml/cid" xmlns:w16="http://schemas.microsoft.com/office/word/2018/wordml" xmlns:w16du="http://schemas.microsoft.com/office/word/2023/wordml/word16du" xmlns:w16sdtdh="http://schemas.microsoft.com/office/word/2020/wordml/sdtdatahash" xmlns:w16sdtfl="http://schemas.microsoft.com/office/word/2024/wordml/sdtformatlock" xmlns:w16se="http://schemas.microsoft.com/office/word/2015/wordml/symex" xmlns:wpg="http://schemas.microsoft.com/office/word/2010/wordprocessingGroup" xmlns:wpi="http://schemas.microsoft.com/office/word/2010/wordprocessingInk" xmlns:wne="http://schemas.microsoft.com/office/word/2006/wordml" xmlns:wps="http://schemas.microsoft.com/office/word/2010/wordprocessingShape" mc:Ignorable="w14 w15 w16se w16cid w16 w16cex w16sdtdh w16sdtfl w16du wp14">
+  <w:p>
+    <w:pPr>
+      <w:pStyle w:val="Footer"/>
+    </w:pPr>
+  </w:p>
+</w:ftr>
+</file>
+
+<file path=word/footer2.xml><?xml version="1.0" encoding="utf-8"?>
+<w:ftr xmlns:wpc="http://schemas.microsoft.com/office/word/2010/wordprocessingCanvas" xmlns:cx="http://schemas.microsoft.com/office/drawing/2014/chartex" xmlns:cx1="http://schemas.microsoft.com/office/drawing/2015/9/8/chartex" xmlns:cx2="http://schemas.microsoft.com/office/drawing/2015/10/21/chartex" xmlns:cx3="http://schemas.microsoft.com/office/drawing/2016/5/9/chartex" xmlns:cx4="http://schemas.microsoft.com/office/drawing/2016/5/10/chartex" xmlns:cx5="http://schemas.microsoft.com/office/drawing/2016/5/11/chartex" xmlns:cx6="http://schemas.microsoft.com/office/drawing/2016/5/12/chartex" xmlns:cx7="http://schemas.microsoft.com/office/drawing/2016/5/13/chartex" xmlns:cx8="http://schemas.microsoft.com/office/drawing/2016/5/14/chartex" xmlns:mc="http://schemas.openxmlformats.org/markup-compatibility/2006" xmlns:aink="http://schemas.microsoft.com/office/drawing/2016/ink" xmlns:am3d="http://schemas.microsoft.com/office/drawing/2017/model3d" xmlns:o="urn:schemas-microsoft-com:office:office" xmlns:oel="http://schemas.microsoft.com/office/2019/extlst" xmlns:r="http://schemas.openxmlformats.org/officeDocument/2006/relationships" xmlns:m="http://schemas.openxmlformats.org/officeDocument/2006/math" xmlns:v="urn:schemas-microsoft-com:vml" xmlns:wp14="http://schemas.microsoft.com/office/word/2010/wordprocessingDrawing" xmlns:wp="http://schemas.openxmlformats.org/drawingml/2006/wordprocessingDrawing" xmlns:w10="urn:schemas-microsoft-com:office:word" xmlns:w="http://schemas.openxmlformats.org/wordprocessingml/2006/main" xmlns:w14="http://schemas.microsoft.com/office/word/2010/wordml" xmlns:w15="http://schemas.microsoft.com/office/word/2012/wordml" xmlns:w16cex="http://schemas.microsoft.com/office/word/2018/wordml/cex" xmlns:w16cid="http://schemas.microsoft.com/office/word/2016/wordml/cid" xmlns:w16="http://schemas.microsoft.com/office/word/2018/wordml" xmlns:w16du="http://schemas.microsoft.com/office/word/2023/wordml/word16du" xmlns:w16sdtdh="http://schemas.microsoft.com/office/word/2020/wordml/sdtdatahash" xmlns:w16sdtfl="http://schemas.microsoft.com/office/word/2024/wordml/sdtformatlock" xmlns:w16se="http://schemas.microsoft.com/office/word/2015/wordml/symex" xmlns:wpg="http://schemas.microsoft.com/office/word/2010/wordprocessingGroup" xmlns:wpi="http://schemas.microsoft.com/office/word/2010/wordprocessingInk" xmlns:wne="http://schemas.microsoft.com/office/word/2006/wordml" xmlns:wps="http://schemas.microsoft.com/office/word/2010/wordprocessingShape" mc:Ignorable="w14 w15 w16se w16cid w16 w16cex w16sdtdh w16sdtfl w16du wp14">
+  <w:p>
+    <w:pPr>
+      <w:pStyle w:val="Footer"/>
+    </w:pPr>
+  </w:p>
+</w:ftr>
+</file>
+
+<file path=word/footer3.xml><?xml version="1.0" encoding="utf-8"?>
+<w:ftr xmlns:wpc="http://schemas.microsoft.com/office/word/2010/wordprocessingCanvas" xmlns:cx="http://schemas.microsoft.com/office/drawing/2014/chartex" xmlns:cx1="http://schemas.microsoft.com/office/drawing/2015/9/8/chartex" xmlns:cx2="http://schemas.microsoft.com/office/drawing/2015/10/21/chartex" xmlns:cx3="http://schemas.microsoft.com/office/drawing/2016/5/9/chartex" xmlns:cx4="http://schemas.microsoft.com/office/drawing/2016/5/10/chartex" xmlns:cx5="http://schemas.microsoft.com/office/drawing/2016/5/11/chartex" xmlns:cx6="http://schemas.microsoft.com/office/drawing/2016/5/12/chartex" xmlns:cx7="http://schemas.microsoft.com/office/drawing/2016/5/13/chartex" xmlns:cx8="http://schemas.microsoft.com/office/drawing/2016/5/14/chartex" xmlns:mc="http://schemas.openxmlformats.org/markup-compatibility/2006" xmlns:aink="http://schemas.microsoft.com/office/drawing/2016/ink" xmlns:am3d="http://schemas.microsoft.com/office/drawing/2017/model3d" xmlns:o="urn:schemas-microsoft-com:office:office" xmlns:oel="http://schemas.microsoft.com/office/2019/extlst" xmlns:r="http://schemas.openxmlformats.org/officeDocument/2006/relationships" xmlns:m="http://schemas.openxmlformats.org/officeDocument/2006/math" xmlns:v="urn:schemas-microsoft-com:vml" xmlns:wp14="http://schemas.microsoft.com/office/word/2010/wordprocessingDrawing" xmlns:wp="http://schemas.openxmlformats.org/drawingml/2006/wordprocessingDrawing" xmlns:w10="urn:schemas-microsoft-com:office:word" xmlns:w="http://schemas.openxmlformats.org/wordprocessingml/2006/main" xmlns:w14="http://schemas.microsoft.com/office/word/2010/wordml" xmlns:w15="http://schemas.microsoft.com/office/word/2012/wordml" xmlns:w16cex="http://schemas.microsoft.com/office/word/2018/wordml/cex" xmlns:w16cid="http://schemas.microsoft.com/office/word/2016/wordml/cid" xmlns:w16="http://schemas.microsoft.com/office/word/2018/wordml" xmlns:w16du="http://schemas.microsoft.com/office/word/2023/wordml/word16du" xmlns:w16sdtdh="http://schemas.microsoft.com/office/word/2020/wordml/sdtdatahash" xmlns:w16sdtfl="http://schemas.microsoft.com/office/word/2024/wordml/sdtformatlock" xmlns:w16se="http://schemas.microsoft.com/office/word/2015/wordml/symex" xmlns:wpg="http://schemas.microsoft.com/office/word/2010/wordprocessingGroup" xmlns:wpi="http://schemas.microsoft.com/office/word/2010/wordprocessingInk" xmlns:wne="http://schemas.microsoft.com/office/word/2006/wordml" xmlns:wps="http://schemas.microsoft.com/office/word/2010/wordprocessingShape" mc:Ignorable="w14 w15 w16se w16cid w16 w16cex w16sdtdh w16sdtfl w16du wp14">
+  <w:p>
+    <w:pPr>
+      <w:pStyle w:val="Footer"/>
+    </w:pPr>
+  </w:p>
+</w:ftr>
+</file>
+
 <file path=word/footnotes.xml><?xml version="1.0" encoding="utf-8"?>
 <w:footnotes xmlns:wpc="http://schemas.microsoft.com/office/word/2010/wordprocessingCanvas" xmlns:cx="http://schemas.microsoft.com/office/drawing/2014/chartex" xmlns:cx1="http://schemas.microsoft.com/office/drawing/2015/9/8/chartex" xmlns:cx2="http://schemas.microsoft.com/office/drawing/2015/10/21/chartex" xmlns:cx3="http://schemas.microsoft.com/office/drawing/2016/5/9/chartex" xmlns:cx4="http://schemas.microsoft.com/office/drawing/2016/5/10/chartex" xmlns:cx5="http://schemas.microsoft.com/office/drawing/2016/5/11/chartex" xmlns:cx6="http://schemas.microsoft.com/office/drawing/2016/5/12/chartex" xmlns:cx7="http://schemas.microsoft.com/office/drawing/2016/5/13/chartex" xmlns:cx8="http://schemas.microsoft.com/office/drawing/2016/5/14/chartex" xmlns:mc="http://schemas.openxmlformats.org/markup-compatibility/2006" xmlns:aink="http://schemas.microsoft.com/office/drawing/2016/ink" xmlns:am3d="http://schemas.microsoft.com/office/drawing/2017/model3d" xmlns:o="urn:schemas-microsoft-com:office:office" xmlns:oel="http://schemas.microsoft.com/office/2019/extlst" xmlns:r="http://schemas.openxmlformats.org/officeDocument/2006/relationships" xmlns:m="http://schemas.openxmlformats.org/officeDocument/2006/math" xmlns:v="urn:schemas-microsoft-com:vml" xmlns:wp14="http://schemas.microsoft.com/office/word/2010/wordprocessingDrawing" xmlns:wp="http://schemas.openxmlformats.org/drawingml/2006/wordprocessingDrawing" xmlns:w10="urn:schemas-microsoft-com:office:word" xmlns:w="http://schemas.openxmlformats.org/wordprocessingml/2006/main" xmlns:w14="http://schemas.microsoft.com/office/word/2010/wordml" xmlns:w15="http://schemas.microsoft.com/office/word/2012/wordml" xmlns:w16cex="http://schemas.microsoft.com/office/word/2018/wordml/cex" xmlns:w16cid="http://schemas.microsoft.com/office/word/2016/wordml/cid" xmlns:w16="http://schemas.microsoft.com/office/word/2018/wordml" xmlns:w16du="http://schemas.microsoft.com/office/word/2023/wordml/word16du" xmlns:w16sdtdh="http://schemas.microsoft.com/office/word/2020/wordml/sdtdatahash" xmlns:w16sdtfl="http://schemas.microsoft.com/office/word/2024/wordml/sdtformatlock" xmlns:w16se="http://schemas.microsoft.com/office/word/2015/wordml/symex" xmlns:wpg="http://schemas.microsoft.com/office/word/2010/wordprocessingGroup" xmlns:wpi="http://schemas.microsoft.com/office/word/2010/wordprocessingInk" xmlns:wne="http://schemas.microsoft.com/office/word/2006/wordml" xmlns:wps="http://schemas.microsoft.com/office/word/2010/wordprocessingShape" mc:Ignorable="w14 w15 w16se w16cid w16 w16cex w16sdtdh w16sdtfl w16du wp14">
   <w:footnote w:type="separator" w:id="-1">
@@ -3561,6 +3598,16 @@
 </file>
 
 <file path=word/header1.xml><?xml version="1.0" encoding="utf-8"?>
+<w:hdr xmlns:wpc="http://schemas.microsoft.com/office/word/2010/wordprocessingCanvas" xmlns:cx="http://schemas.microsoft.com/office/drawing/2014/chartex" xmlns:cx1="http://schemas.microsoft.com/office/drawing/2015/9/8/chartex" xmlns:cx2="http://schemas.microsoft.com/office/drawing/2015/10/21/chartex" xmlns:cx3="http://schemas.microsoft.com/office/drawing/2016/5/9/chartex" xmlns:cx4="http://schemas.microsoft.com/office/drawing/2016/5/10/chartex" xmlns:cx5="http://schemas.microsoft.com/office/drawing/2016/5/11/chartex" xmlns:cx6="http://schemas.microsoft.com/office/drawing/2016/5/12/chartex" xmlns:cx7="http://schemas.microsoft.com/office/drawing/2016/5/13/chartex" xmlns:cx8="http://schemas.microsoft.com/office/drawing/2016/5/14/chartex" xmlns:mc="http://schemas.openxmlformats.org/markup-compatibility/2006" xmlns:aink="http://schemas.microsoft.com/office/drawing/2016/ink" xmlns:am3d="http://schemas.microsoft.com/office/drawing/2017/model3d" xmlns:o="urn:schemas-microsoft-com:office:office" xmlns:oel="http://schemas.microsoft.com/office/2019/extlst" xmlns:r="http://schemas.openxmlformats.org/officeDocument/2006/relationships" xmlns:m="http://schemas.openxmlformats.org/officeDocument/2006/math" xmlns:v="urn:schemas-microsoft-com:vml" xmlns:wp14="http://schemas.microsoft.com/office/word/2010/wordprocessingDrawing" xmlns:wp="http://schemas.openxmlformats.org/drawingml/2006/wordprocessingDrawing" xmlns:w10="urn:schemas-microsoft-com:office:word" xmlns:w="http://schemas.openxmlformats.org/wordprocessingml/2006/main" xmlns:w14="http://schemas.microsoft.com/office/word/2010/wordml" xmlns:w15="http://schemas.microsoft.com/office/word/2012/wordml" xmlns:w16cex="http://schemas.microsoft.com/office/word/2018/wordml/cex" xmlns:w16cid="http://schemas.microsoft.com/office/word/2016/wordml/cid" xmlns:w16="http://schemas.microsoft.com/office/word/2018/wordml" xmlns:w16du="http://schemas.microsoft.com/office/word/2023/wordml/word16du" xmlns:w16sdtdh="http://schemas.microsoft.com/office/word/2020/wordml/sdtdatahash" xmlns:w16sdtfl="http://schemas.microsoft.com/office/word/2024/wordml/sdtformatlock" xmlns:w16se="http://schemas.microsoft.com/office/word/2015/wordml/symex" xmlns:wpg="http://schemas.microsoft.com/office/word/2010/wordprocessingGroup" xmlns:wpi="http://schemas.microsoft.com/office/word/2010/wordprocessingInk" xmlns:wne="http://schemas.microsoft.com/office/word/2006/wordml" xmlns:wps="http://schemas.microsoft.com/office/word/2010/wordprocessingShape" mc:Ignorable="w14 w15 w16se w16cid w16 w16cex w16sdtdh w16sdtfl w16du wp14">
+  <w:p>
+    <w:pPr>
+      <w:pStyle w:val="Header"/>
+    </w:pPr>
+  </w:p>
+</w:hdr>
+</file>
+
+<file path=word/header2.xml><?xml version="1.0" encoding="utf-8"?>
 <w:hdr xmlns:wpc="http://schemas.microsoft.com/office/word/2010/wordprocessingCanvas" xmlns:cx="http://schemas.microsoft.com/office/drawing/2014/chartex" xmlns:cx1="http://schemas.microsoft.com/office/drawing/2015/9/8/chartex" xmlns:cx2="http://schemas.microsoft.com/office/drawing/2015/10/21/chartex" xmlns:cx3="http://schemas.microsoft.com/office/drawing/2016/5/9/chartex" xmlns:cx4="http://schemas.microsoft.com/office/drawing/2016/5/10/chartex" xmlns:cx5="http://schemas.microsoft.com/office/drawing/2016/5/11/chartex" xmlns:cx6="http://schemas.microsoft.com/office/drawing/2016/5/12/chartex" xmlns:cx7="http://schemas.microsoft.com/office/drawing/2016/5/13/chartex" xmlns:cx8="http://schemas.microsoft.com/office/drawing/2016/5/14/chartex" xmlns:mc="http://schemas.openxmlformats.org/markup-compatibility/2006" xmlns:aink="http://schemas.microsoft.com/office/drawing/2016/ink" xmlns:am3d="http://schemas.microsoft.com/office/drawing/2017/model3d" xmlns:o="urn:schemas-microsoft-com:office:office" xmlns:oel="http://schemas.microsoft.com/office/2019/extlst" xmlns:r="http://schemas.openxmlformats.org/officeDocument/2006/relationships" xmlns:m="http://schemas.openxmlformats.org/officeDocument/2006/math" xmlns:v="urn:schemas-microsoft-com:vml" xmlns:wp14="http://schemas.microsoft.com/office/word/2010/wordprocessingDrawing" xmlns:wp="http://schemas.openxmlformats.org/drawingml/2006/wordprocessingDrawing" xmlns:w10="urn:schemas-microsoft-com:office:word" xmlns:w="http://schemas.openxmlformats.org/wordprocessingml/2006/main" xmlns:w14="http://schemas.microsoft.com/office/word/2010/wordml" xmlns:w15="http://schemas.microsoft.com/office/word/2012/wordml" xmlns:w16cex="http://schemas.microsoft.com/office/word/2018/wordml/cex" xmlns:w16cid="http://schemas.microsoft.com/office/word/2016/wordml/cid" xmlns:w16="http://schemas.microsoft.com/office/word/2018/wordml" xmlns:w16du="http://schemas.microsoft.com/office/word/2023/wordml/word16du" xmlns:w16sdtdh="http://schemas.microsoft.com/office/word/2020/wordml/sdtdatahash" xmlns:w16sdtfl="http://schemas.microsoft.com/office/word/2024/wordml/sdtformatlock" xmlns:w16se="http://schemas.microsoft.com/office/word/2015/wordml/symex" xmlns:wpg="http://schemas.microsoft.com/office/word/2010/wordprocessingGroup" xmlns:wpi="http://schemas.microsoft.com/office/word/2010/wordprocessingInk" xmlns:wne="http://schemas.microsoft.com/office/word/2006/wordml" xmlns:wps="http://schemas.microsoft.com/office/word/2010/wordprocessingShape" mc:Ignorable="w14 w15 w16se w16cid w16 w16cex w16sdtdh w16sdtfl w16du wp14">
   <w:p>
     <w:pPr>
@@ -3858,13 +3905,23 @@
         </mc:Choice>
         <mc:Fallback>
           <w:pict>
-            <v:line w14:anchorId="1319E91F" id="Straight Connector 2" o:spid="_x0000_s1026" style="position:absolute;z-index:251659264;visibility:visible;mso-wrap-style:square;mso-width-percent:0;mso-height-percent:0;mso-wrap-distance-left:9pt;mso-wrap-distance-top:0;mso-wrap-distance-right:9pt;mso-wrap-distance-bottom:0;mso-position-horizontal:absolute;mso-position-horizontal-relative:text;mso-position-vertical:absolute;mso-position-vertical-relative:text;mso-width-percent:0;mso-height-percent:0;mso-width-relative:page;mso-height-relative:page" from="-65.75pt,4pt" to="493pt,4pt" o:gfxdata="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" strokecolor="black [3213]" strokeweight="4pt">
+            <v:line w14:anchorId="173392AC" id="Straight Connector 2" o:spid="_x0000_s1026" style="position:absolute;z-index:251659264;visibility:visible;mso-wrap-style:square;mso-width-percent:0;mso-height-percent:0;mso-wrap-distance-left:9pt;mso-wrap-distance-top:0;mso-wrap-distance-right:9pt;mso-wrap-distance-bottom:0;mso-position-horizontal:absolute;mso-position-horizontal-relative:text;mso-position-vertical:absolute;mso-position-vertical-relative:text;mso-width-percent:0;mso-height-percent:0;mso-width-relative:page;mso-height-relative:page" from="-65.75pt,4pt" to="493pt,4pt" o:gfxdata="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" strokecolor="black [3213]" strokeweight="4pt">
               <v:stroke linestyle="thickThin"/>
             </v:line>
           </w:pict>
         </mc:Fallback>
       </mc:AlternateContent>
     </w:r>
+  </w:p>
+</w:hdr>
+</file>
+
+<file path=word/header3.xml><?xml version="1.0" encoding="utf-8"?>
+<w:hdr xmlns:wpc="http://schemas.microsoft.com/office/word/2010/wordprocessingCanvas" xmlns:cx="http://schemas.microsoft.com/office/drawing/2014/chartex" xmlns:cx1="http://schemas.microsoft.com/office/drawing/2015/9/8/chartex" xmlns:cx2="http://schemas.microsoft.com/office/drawing/2015/10/21/chartex" xmlns:cx3="http://schemas.microsoft.com/office/drawing/2016/5/9/chartex" xmlns:cx4="http://schemas.microsoft.com/office/drawing/2016/5/10/chartex" xmlns:cx5="http://schemas.microsoft.com/office/drawing/2016/5/11/chartex" xmlns:cx6="http://schemas.microsoft.com/office/drawing/2016/5/12/chartex" xmlns:cx7="http://schemas.microsoft.com/office/drawing/2016/5/13/chartex" xmlns:cx8="http://schemas.microsoft.com/office/drawing/2016/5/14/chartex" xmlns:mc="http://schemas.openxmlformats.org/markup-compatibility/2006" xmlns:aink="http://schemas.microsoft.com/office/drawing/2016/ink" xmlns:am3d="http://schemas.microsoft.com/office/drawing/2017/model3d" xmlns:o="urn:schemas-microsoft-com:office:office" xmlns:oel="http://schemas.microsoft.com/office/2019/extlst" xmlns:r="http://schemas.openxmlformats.org/officeDocument/2006/relationships" xmlns:m="http://schemas.openxmlformats.org/officeDocument/2006/math" xmlns:v="urn:schemas-microsoft-com:vml" xmlns:wp14="http://schemas.microsoft.com/office/word/2010/wordprocessingDrawing" xmlns:wp="http://schemas.openxmlformats.org/drawingml/2006/wordprocessingDrawing" xmlns:w10="urn:schemas-microsoft-com:office:word" xmlns:w="http://schemas.openxmlformats.org/wordprocessingml/2006/main" xmlns:w14="http://schemas.microsoft.com/office/word/2010/wordml" xmlns:w15="http://schemas.microsoft.com/office/word/2012/wordml" xmlns:w16cex="http://schemas.microsoft.com/office/word/2018/wordml/cex" xmlns:w16cid="http://schemas.microsoft.com/office/word/2016/wordml/cid" xmlns:w16="http://schemas.microsoft.com/office/word/2018/wordml" xmlns:w16du="http://schemas.microsoft.com/office/word/2023/wordml/word16du" xmlns:w16sdtdh="http://schemas.microsoft.com/office/word/2020/wordml/sdtdatahash" xmlns:w16sdtfl="http://schemas.microsoft.com/office/word/2024/wordml/sdtformatlock" xmlns:w16se="http://schemas.microsoft.com/office/word/2015/wordml/symex" xmlns:wpg="http://schemas.microsoft.com/office/word/2010/wordprocessingGroup" xmlns:wpi="http://schemas.microsoft.com/office/word/2010/wordprocessingInk" xmlns:wne="http://schemas.microsoft.com/office/word/2006/wordml" xmlns:wps="http://schemas.microsoft.com/office/word/2010/wordprocessingShape" mc:Ignorable="w14 w15 w16se w16cid w16 w16cex w16sdtdh w16sdtfl w16du wp14">
+  <w:p>
+    <w:pPr>
+      <w:pStyle w:val="Header"/>
+    </w:pPr>
   </w:p>
 </w:hdr>
 </file>
@@ -4812,4 +4869,43 @@
   <a:objectDefaults/>
   <a:extraClrSchemeLst/>
 </a:theme>
+</file>
+
+<file path=word/webextensions/taskpanes.xml><?xml version="1.0" encoding="utf-8"?>
+<wetp:taskpanes xmlns:wetp="http://schemas.microsoft.com/office/webextensions/taskpanes/2010/11">
+  <wetp:taskpane dockstate="right" visibility="0" width="438" row="1">
+    <wetp:webextensionref xmlns:r="http://schemas.openxmlformats.org/officeDocument/2006/relationships" r:id="rId1"/>
+  </wetp:taskpane>
+  <wetp:taskpane dockstate="right" visibility="0" width="438" row="2">
+    <wetp:webextensionref xmlns:r="http://schemas.openxmlformats.org/officeDocument/2006/relationships" r:id="rId2"/>
+  </wetp:taskpane>
+</wetp:taskpanes>
+</file>
+
+<file path=word/webextensions/webextension1.xml><?xml version="1.0" encoding="utf-8"?>
+<we:webextension xmlns:we="http://schemas.microsoft.com/office/webextensions/webextension/2010/11" id="{5638192D-449F-4F20-AEA1-CD8230A75577}">
+  <we:reference id="wa200010453" version="1.0.0.1" store="en-GB" storeType="OMEX"/>
+  <we:alternateReferences>
+    <we:reference id="wa200010453" version="1.0.0.1" store="WA200010453" storeType="OMEX"/>
+  </we:alternateReferences>
+  <we:properties>
+    <we:property name="claude.fileId" value="&quot;5f21a579-d4b9-479f-ab4a-e68a22f38f6d&quot;"/>
+  </we:properties>
+  <we:bindings/>
+  <we:snapshot xmlns:r="http://schemas.openxmlformats.org/officeDocument/2006/relationships"/>
+</we:webextension>
+</file>
+
+<file path=word/webextensions/webextension2.xml><?xml version="1.0" encoding="utf-8"?>
+<we:webextension xmlns:we="http://schemas.microsoft.com/office/webextensions/webextension/2010/11" id="{BFCE9DAF-8D2D-4B55-A48B-E73EBDF5ECE7}">
+  <we:reference id="wa200010725" version="1.0.0.1" store="en-001" storeType="OMEX"/>
+  <we:alternateReferences>
+    <we:reference id="WA200010725" version="1.0.0.1" store="" storeType="OMEX"/>
+  </we:alternateReferences>
+  <we:properties>
+    <we:property name="claude.fileId" value="&quot;aa446cf7-207e-4454-8a56-ddab7685e0c6&quot;"/>
+  </we:properties>
+  <we:bindings/>
+  <we:snapshot xmlns:r="http://schemas.openxmlformats.org/officeDocument/2006/relationships"/>
+</we:webextension>
 </file>
</xml_diff>